<commit_message>
Make Task A and Task B reports text-only
Drop charts, KPI tiles, the cover band and callout boxes from both reports;
the facts the diagrams carried are now in the text. The two holiday
calendars the deck uses are drawn by deck_charts.py instead.

Co-authored-by: Cursor <cursoragent@cursor.com>
</commit_message>
<xml_diff>
--- a/submission/TaskA_Holiday_Scraper_Report.docx
+++ b/submission/TaskA_Holiday_Scraper_Report.docx
@@ -2,204 +2,103 @@
 <file path=word/document.xml><?xml version="1.0" encoding="utf-8"?>
 <w:document xmlns:wpc="http://schemas.microsoft.com/office/word/2010/wordprocessingCanvas" xmlns:mo="http://schemas.microsoft.com/office/mac/office/2008/main" xmlns:mc="http://schemas.openxmlformats.org/markup-compatibility/2006" xmlns:mv="urn:schemas-microsoft-com:mac:vml" xmlns:o="urn:schemas-microsoft-com:office:office" xmlns:r="http://schemas.openxmlformats.org/officeDocument/2006/relationships" xmlns:m="http://schemas.openxmlformats.org/officeDocument/2006/math" xmlns:v="urn:schemas-microsoft-com:vml" xmlns:wp14="http://schemas.microsoft.com/office/word/2010/wordprocessingDrawing" xmlns:wp="http://schemas.openxmlformats.org/drawingml/2006/wordprocessingDrawing" xmlns:w10="urn:schemas-microsoft-com:office:word" xmlns:w="http://schemas.openxmlformats.org/wordprocessingml/2006/main" xmlns:w14="http://schemas.microsoft.com/office/word/2010/wordml" xmlns:wpg="http://schemas.microsoft.com/office/word/2010/wordprocessingGroup" xmlns:wpi="http://schemas.microsoft.com/office/word/2010/wordprocessingInk" xmlns:wne="http://schemas.microsoft.com/office/word/2006/wordml" xmlns:wps="http://schemas.microsoft.com/office/word/2010/wordprocessingShape" mc:Ignorable="w14 wp14">
   <w:body>
-    <w:tbl>
-      <w:tblPr>
-        <w:tblW w:type="auto" w:w="0"/>
-        <w:jc w:val="center"/>
-        <w:tblLook w:firstColumn="1" w:firstRow="1" w:lastColumn="0" w:lastRow="0" w:noHBand="0" w:noVBand="1" w:val="04A0"/>
-      </w:tblPr>
-      <w:tblGrid>
-        <w:gridCol w:w="9412"/>
-      </w:tblGrid>
-      <w:tr>
-        <w:tc>
-          <w:tcPr>
-            <w:tcW w:type="dxa" w:w="9412"/>
-            <w:shd w:val="clear" w:color="auto" w:fill="14213D"/>
-            <w:tcMar>
-              <w:top w:w="340" w:type="dxa"/>
-              <w:left w:w="340" w:type="dxa"/>
-              <w:bottom w:w="340" w:type="dxa"/>
-              <w:right w:w="340" w:type="dxa"/>
-            </w:tcMar>
-          </w:tcPr>
-          <w:p>
-            <w:r>
-              <w:rPr>
-                <w:b/>
-                <w:color w:val="E9A23B"/>
-                <w:sz w:val="22"/>
-              </w:rPr>
-              <w:t>TASK A · L2 SUPPORT ENGINEER ASSESSMENT</w:t>
-            </w:r>
-          </w:p>
-          <w:p>
-            <w:r>
-              <w:rPr>
-                <w:b/>
-                <w:color w:val="FFFFFF"/>
-                <w:sz w:val="56"/>
-              </w:rPr>
-              <w:t>Trading-holiday scraper</w:t>
-            </w:r>
-          </w:p>
-          <w:p>
-            <w:r>
-              <w:rPr>
-                <w:color w:val="DDE3EC"/>
-                <w:sz w:val="26"/>
-              </w:rPr>
-              <w:t>How it was built, every logical step it takes, what the live run produced and what it refuses to do</w:t>
-            </w:r>
-          </w:p>
-        </w:tc>
-      </w:tr>
-    </w:tbl>
-    <w:p/>
-    <w:tbl>
-      <w:tblPr>
-        <w:tblStyle w:val="TableGrid"/>
-        <w:tblW w:type="auto" w:w="0"/>
-        <w:tblLayout w:type="fixed"/>
-        <w:tblLook w:firstColumn="1" w:firstRow="1" w:lastColumn="0" w:lastRow="0" w:noHBand="0" w:noVBand="1" w:val="04A0"/>
-        <w:tblLayout w:type="fixed"/>
-      </w:tblPr>
-      <w:tblGrid>
-        <w:gridCol w:w="2551"/>
-        <w:gridCol w:w="6860"/>
-      </w:tblGrid>
-      <w:tr>
-        <w:tc>
-          <w:tcPr>
-            <w:tcW w:type="dxa" w:w="2551"/>
-            <w:shd w:val="clear" w:color="auto" w:fill="F4F6FA"/>
-          </w:tcPr>
-          <w:p>
-            <w:r>
-              <w:rPr>
-                <w:b/>
-              </w:rPr>
-              <w:t>Live run</w:t>
-            </w:r>
-          </w:p>
-        </w:tc>
-        <w:tc>
-          <w:tcPr>
-            <w:tcW w:type="dxa" w:w="6860"/>
-          </w:tcPr>
-          <w:p>
-            <w:r>
-              <w:t>2026-10-19 08:41:28 UTC · overall validation WARN</w:t>
-            </w:r>
-          </w:p>
-        </w:tc>
-      </w:tr>
-      <w:tr>
-        <w:tc>
-          <w:tcPr>
-            <w:tcW w:type="dxa" w:w="2551"/>
-            <w:shd w:val="clear" w:color="auto" w:fill="F4F6FA"/>
-          </w:tcPr>
-          <w:p>
-            <w:r>
-              <w:rPr>
-                <w:b/>
-              </w:rPr>
-              <w:t>Rows</w:t>
-            </w:r>
-          </w:p>
-        </w:tc>
-        <w:tc>
-          <w:tcPr>
-            <w:tcW w:type="dxa" w:w="6860"/>
-          </w:tcPr>
-          <w:p>
-            <w:r>
-              <w:t>75: NYSE 34, NASDAQ 12, OPRA 14, CME 15</w:t>
-            </w:r>
-          </w:p>
-        </w:tc>
-      </w:tr>
-      <w:tr>
-        <w:tc>
-          <w:tcPr>
-            <w:tcW w:type="dxa" w:w="2551"/>
-            <w:shd w:val="clear" w:color="auto" w:fill="F4F6FA"/>
-          </w:tcPr>
-          <w:p>
-            <w:r>
-              <w:rPr>
-                <w:b/>
-              </w:rPr>
-              <w:t>Code</w:t>
-            </w:r>
-          </w:p>
-        </w:tc>
-        <w:tc>
-          <w:tcPr>
-            <w:tcW w:type="dxa" w:w="6860"/>
-          </w:tcPr>
-          <w:p>
-            <w:r>
-              <w:t>deliverables/taskA_holidays/scraper/ (Python 3.12), offline fixture tests</w:t>
-            </w:r>
-          </w:p>
-        </w:tc>
-      </w:tr>
-      <w:tr>
-        <w:tc>
-          <w:tcPr>
-            <w:tcW w:type="dxa" w:w="2551"/>
-            <w:shd w:val="clear" w:color="auto" w:fill="F4F6FA"/>
-          </w:tcPr>
-          <w:p>
-            <w:r>
-              <w:rPr>
-                <w:b/>
-              </w:rPr>
-              <w:t>Automation</w:t>
-            </w:r>
-          </w:p>
-        </w:tc>
-        <w:tc>
-          <w:tcPr>
-            <w:tcW w:type="dxa" w:w="6860"/>
-          </w:tcPr>
-          <w:p>
-            <w:r>
-              <w:t>.github/workflows/trading-holidays.yml, weekly and on demand</w:t>
-            </w:r>
-          </w:p>
-        </w:tc>
-      </w:tr>
-      <w:tr>
-        <w:tc>
-          <w:tcPr>
-            <w:tcW w:type="dxa" w:w="2551"/>
-            <w:shd w:val="clear" w:color="auto" w:fill="F4F6FA"/>
-          </w:tcPr>
-          <w:p>
-            <w:r>
-              <w:rPr>
-                <w:b/>
-              </w:rPr>
-              <w:t>Published to</w:t>
-            </w:r>
-          </w:p>
-        </w:tc>
-        <w:tc>
-          <w:tcPr>
-            <w:tcW w:type="dxa" w:w="6860"/>
-          </w:tcPr>
-          <w:p>
-            <w:r>
-              <w:t>Google Drive (four CSVs, uploaded by hand on 18 Oct) and the GitHub repository</w:t>
-            </w:r>
-          </w:p>
-        </w:tc>
-      </w:tr>
-    </w:tbl>
-    <w:p/>
+    <w:p>
+      <w:r>
+        <w:rPr>
+          <w:color w:val="5C677D"/>
+          <w:sz w:val="22"/>
+        </w:rPr>
+        <w:t>Task A · L2 Support Engineer assessment</w:t>
+      </w:r>
+    </w:p>
+    <w:p>
+      <w:r>
+        <w:rPr>
+          <w:b/>
+          <w:sz w:val="48"/>
+        </w:rPr>
+        <w:t>Trading-holiday scraper</w:t>
+      </w:r>
+    </w:p>
+    <w:p>
+      <w:r>
+        <w:rPr>
+          <w:i/>
+          <w:sz w:val="24"/>
+        </w:rPr>
+        <w:t>How it was built, every logical step it takes, what the live run produced and what it refuses to do</w:t>
+      </w:r>
+    </w:p>
+    <w:p>
+      <w:r>
+        <w:rPr>
+          <w:b/>
+        </w:rPr>
+        <w:t xml:space="preserve">Live run: </w:t>
+      </w:r>
+      <w:r>
+        <w:rPr>
+          <w:i w:val="0"/>
+        </w:rPr>
+        <w:t>2026-10-19 08:41:28 UTC · overall validation WARN</w:t>
+      </w:r>
+    </w:p>
+    <w:p>
+      <w:r>
+        <w:rPr>
+          <w:b/>
+        </w:rPr>
+        <w:t xml:space="preserve">Rows: </w:t>
+      </w:r>
+      <w:r>
+        <w:rPr>
+          <w:i w:val="0"/>
+        </w:rPr>
+        <w:t>75: NYSE 34, NASDAQ 12, OPRA 14, CME 15</w:t>
+      </w:r>
+    </w:p>
+    <w:p>
+      <w:r>
+        <w:rPr>
+          <w:b/>
+        </w:rPr>
+        <w:t xml:space="preserve">Code: </w:t>
+      </w:r>
+      <w:r>
+        <w:rPr>
+          <w:i w:val="0"/>
+        </w:rPr>
+        <w:t>deliverables/taskA_holidays/scraper/ (Python 3.12), offline fixture tests</w:t>
+      </w:r>
+    </w:p>
+    <w:p>
+      <w:r>
+        <w:rPr>
+          <w:b/>
+        </w:rPr>
+        <w:t xml:space="preserve">Automation: </w:t>
+      </w:r>
+      <w:r>
+        <w:rPr>
+          <w:i w:val="0"/>
+        </w:rPr>
+        <w:t>.github/workflows/trading-holidays.yml, weekly and on demand</w:t>
+      </w:r>
+    </w:p>
+    <w:p>
+      <w:r>
+        <w:rPr>
+          <w:b/>
+        </w:rPr>
+        <w:t xml:space="preserve">Published to: </w:t>
+      </w:r>
+      <w:r>
+        <w:rPr>
+          <w:i w:val="0"/>
+        </w:rPr>
+        <w:t>Google Drive (CSVs uploaded by hand) and the GitHub repository</w:t>
+      </w:r>
+    </w:p>
     <w:p>
       <w:r>
         <w:rPr>
@@ -207,11 +106,6 @@
           <w:color w:val="5C677D"/>
         </w:rPr>
         <w:t>Irakli — L2 Support Engineer candidate · 18 October 2026</w:t>
-      </w:r>
-    </w:p>
-    <w:p>
-      <w:r>
-        <w:br w:type="page"/>
       </w:r>
     </w:p>
     <w:p>
@@ -230,269 +124,12 @@
         <w:t>The task was to collect trading holidays and early closes for several US exchanges, normalise them into one schema with UTC times, validate them, and publish them to Google Drive automatically. I treated it as a small production job rather than a one-off script: every source was inspected before a parser was written, every response body is kept on disk, every adapter fails independently, and the validation step reports problems instead of quietly fixing them.</w:t>
       </w:r>
     </w:p>
-    <w:tbl>
-      <w:tblPr>
-        <w:tblW w:type="auto" w:w="0"/>
-        <w:jc w:val="center"/>
-        <w:tblLayout w:type="fixed"/>
-        <w:tblLook w:firstColumn="1" w:firstRow="1" w:lastColumn="0" w:lastRow="0" w:noHBand="0" w:noVBand="1" w:val="04A0"/>
-        <w:tblLayout w:type="fixed"/>
-      </w:tblPr>
-      <w:tblGrid>
-        <w:gridCol w:w="1882"/>
-        <w:gridCol w:w="1882"/>
-        <w:gridCol w:w="1882"/>
-        <w:gridCol w:w="1882"/>
-        <w:gridCol w:w="1882"/>
-      </w:tblGrid>
-      <w:tr>
-        <w:tc>
-          <w:tcPr>
-            <w:tcW w:type="dxa" w:w="1882"/>
-            <w:shd w:val="clear" w:color="auto" w:fill="14213D"/>
-            <w:tcMar>
-              <w:top w:w="141" w:type="dxa"/>
-              <w:left w:w="141" w:type="dxa"/>
-              <w:bottom w:w="141" w:type="dxa"/>
-              <w:right w:w="141" w:type="dxa"/>
-            </w:tcMar>
-          </w:tcPr>
-          <w:p>
-            <w:pPr>
-              <w:jc w:val="center"/>
-            </w:pPr>
-            <w:r>
-              <w:rPr>
-                <w:b/>
-                <w:color w:val="FFFFFF"/>
-                <w:sz w:val="36"/>
-              </w:rPr>
-              <w:t>75</w:t>
-            </w:r>
-          </w:p>
-          <w:p>
-            <w:pPr>
-              <w:jc w:val="center"/>
-            </w:pPr>
-            <w:r>
-              <w:rPr>
-                <w:color w:val="FFFFFF"/>
-                <w:sz w:val="17"/>
-              </w:rPr>
-              <w:t>rows published</w:t>
-            </w:r>
-          </w:p>
-        </w:tc>
-        <w:tc>
-          <w:tcPr>
-            <w:tcW w:type="dxa" w:w="1882"/>
-            <w:shd w:val="clear" w:color="auto" w:fill="0F8B8D"/>
-            <w:tcMar>
-              <w:top w:w="141" w:type="dxa"/>
-              <w:left w:w="141" w:type="dxa"/>
-              <w:bottom w:w="141" w:type="dxa"/>
-              <w:right w:w="141" w:type="dxa"/>
-            </w:tcMar>
-          </w:tcPr>
-          <w:p>
-            <w:pPr>
-              <w:jc w:val="center"/>
-            </w:pPr>
-            <w:r>
-              <w:rPr>
-                <w:b/>
-                <w:color w:val="FFFFFF"/>
-                <w:sz w:val="36"/>
-              </w:rPr>
-              <w:t>34</w:t>
-            </w:r>
-          </w:p>
-          <w:p>
-            <w:pPr>
-              <w:jc w:val="center"/>
-            </w:pPr>
-            <w:r>
-              <w:rPr>
-                <w:color w:val="FFFFFF"/>
-                <w:sz w:val="17"/>
-              </w:rPr>
-              <w:t>NYSE, 2026–2028</w:t>
-            </w:r>
-          </w:p>
-        </w:tc>
-        <w:tc>
-          <w:tcPr>
-            <w:tcW w:type="dxa" w:w="1882"/>
-            <w:shd w:val="clear" w:color="auto" w:fill="2A9D8F"/>
-            <w:tcMar>
-              <w:top w:w="141" w:type="dxa"/>
-              <w:left w:w="141" w:type="dxa"/>
-              <w:bottom w:w="141" w:type="dxa"/>
-              <w:right w:w="141" w:type="dxa"/>
-            </w:tcMar>
-          </w:tcPr>
-          <w:p>
-            <w:pPr>
-              <w:jc w:val="center"/>
-            </w:pPr>
-            <w:r>
-              <w:rPr>
-                <w:b/>
-                <w:color w:val="FFFFFF"/>
-                <w:sz w:val="36"/>
-              </w:rPr>
-              <w:t>0</w:t>
-            </w:r>
-          </w:p>
-          <w:p>
-            <w:pPr>
-              <w:jc w:val="center"/>
-            </w:pPr>
-            <w:r>
-              <w:rPr>
-                <w:color w:val="FFFFFF"/>
-                <w:sz w:val="17"/>
-              </w:rPr>
-              <w:t>differences: NYSE vs NASDAQ 2026, NYSE vs CME 2027</w:t>
-            </w:r>
-          </w:p>
-        </w:tc>
-        <w:tc>
-          <w:tcPr>
-            <w:tcW w:type="dxa" w:w="1882"/>
-            <w:shd w:val="clear" w:color="auto" w:fill="E9A23B"/>
-            <w:tcMar>
-              <w:top w:w="141" w:type="dxa"/>
-              <w:left w:w="141" w:type="dxa"/>
-              <w:bottom w:w="141" w:type="dxa"/>
-              <w:right w:w="141" w:type="dxa"/>
-            </w:tcMar>
-          </w:tcPr>
-          <w:p>
-            <w:pPr>
-              <w:jc w:val="center"/>
-            </w:pPr>
-            <w:r>
-              <w:rPr>
-                <w:b/>
-                <w:color w:val="FFFFFF"/>
-                <w:sz w:val="36"/>
-              </w:rPr>
-              <w:t>WARN</w:t>
-            </w:r>
-          </w:p>
-          <w:p>
-            <w:pPr>
-              <w:jc w:val="center"/>
-            </w:pPr>
-            <w:r>
-              <w:rPr>
-                <w:color w:val="FFFFFF"/>
-                <w:sz w:val="17"/>
-              </w:rPr>
-              <w:t>overall validation</w:t>
-            </w:r>
-          </w:p>
-        </w:tc>
-        <w:tc>
-          <w:tcPr>
-            <w:tcW w:type="dxa" w:w="1882"/>
-            <w:shd w:val="clear" w:color="auto" w:fill="E76F51"/>
-            <w:tcMar>
-              <w:top w:w="141" w:type="dxa"/>
-              <w:left w:w="141" w:type="dxa"/>
-              <w:bottom w:w="141" w:type="dxa"/>
-              <w:right w:w="141" w:type="dxa"/>
-            </w:tcMar>
-          </w:tcPr>
-          <w:p>
-            <w:pPr>
-              <w:jc w:val="center"/>
-            </w:pPr>
-            <w:r>
-              <w:rPr>
-                <w:b/>
-                <w:color w:val="FFFFFF"/>
-                <w:sz w:val="36"/>
-              </w:rPr>
-              <w:t>15</w:t>
-            </w:r>
-          </w:p>
-          <w:p>
-            <w:pPr>
-              <w:jc w:val="center"/>
-            </w:pPr>
-            <w:r>
-              <w:rPr>
-                <w:color w:val="FFFFFF"/>
-                <w:sz w:val="17"/>
-              </w:rPr>
-              <w:t>CME equity index rows (manual xlsx)</w:t>
-            </w:r>
-          </w:p>
-        </w:tc>
-      </w:tr>
-    </w:tbl>
-    <w:p/>
     <w:p>
-      <w:pPr>
-        <w:keepNext/>
-        <w:jc w:val="center"/>
-      </w:pPr>
-      <w:r>
-        <w:drawing>
-          <wp:inline xmlns:a="http://schemas.openxmlformats.org/drawingml/2006/main" xmlns:pic="http://schemas.openxmlformats.org/drawingml/2006/picture">
-            <wp:extent cx="5760000" cy="2665553"/>
-            <wp:docPr id="1" name="Picture 1"/>
-            <wp:cNvGraphicFramePr>
-              <a:graphicFrameLocks noChangeAspect="1"/>
-            </wp:cNvGraphicFramePr>
-            <a:graphic>
-              <a:graphicData uri="http://schemas.openxmlformats.org/drawingml/2006/picture">
-                <pic:pic>
-                  <pic:nvPicPr>
-                    <pic:cNvPr id="0" name="rows_by_exchange.png"/>
-                    <pic:cNvPicPr/>
-                  </pic:nvPicPr>
-                  <pic:blipFill>
-                    <a:blip r:embed="rId9"/>
-                    <a:stretch>
-                      <a:fillRect/>
-                    </a:stretch>
-                  </pic:blipFill>
-                  <pic:spPr>
-                    <a:xfrm>
-                      <a:off x="0" y="0"/>
-                      <a:ext cx="5760000" cy="2665553"/>
-                    </a:xfrm>
-                    <a:prstGeom prst="rect"/>
-                  </pic:spPr>
-                </pic:pic>
-              </a:graphicData>
-            </a:graphic>
-          </wp:inline>
-        </w:drawing>
-      </w:r>
-    </w:p>
-    <w:p>
-      <w:pPr>
-        <w:jc w:val="center"/>
-      </w:pPr>
       <w:r>
         <w:rPr>
-          <w:b/>
-          <w:color w:val="0F8B8D"/>
-          <w:sz w:val="19"/>
+          <w:i w:val="0"/>
         </w:rPr>
-        <w:t xml:space="preserve">Figure 1. </w:t>
-      </w:r>
-      <w:r>
-        <w:rPr>
-          <w:i/>
-          <w:color w:val="5C677D"/>
-          <w:sz w:val="19"/>
-        </w:rPr>
-        <w:t>Rows per exchange in the latest run. CME comes from Trading Hours xlsx files I downloaded by hand.</w:t>
+        <w:t>The latest run published 75 rows: NYSE 34 (2026–2028), NASDAQ 12 (2026), OPRA 14 (the 2025 schedule) and CME 15 (Thanksgiving and Christmas 2026 plus all of 2027, from Trading Hours files I downloaded by hand). Of the 27 validation checks, 25 passed, 2 warned and 0 failed, so the overall result is WARN.</w:t>
       </w:r>
     </w:p>
     <w:p>
@@ -516,7 +153,7 @@
         <w:rPr>
           <w:i w:val="0"/>
         </w:rPr>
-        <w:t>These four CSVs are the deliverable. The uploader finds each file by name and overwrites it, so a weekly run never creates duplicates. That is why the names must not change.</w:t>
+        <w:t>These CSVs are the deliverable. The uploader finds each file by name and overwrites it, so a weekly run never creates duplicates. That is why the names must not change.</w:t>
       </w:r>
     </w:p>
     <w:tbl>
@@ -988,7 +625,7 @@
         <w:rPr>
           <w:i w:val="0"/>
         </w:rPr>
-        <w:t>Not uploaded: _previous_combined.csv (the baseline for the run-to-run diff), run_meta.json and upload_manifest.json (internal bookkeeping), and raw/ (evidence, not the calendar). When the Drive secrets are configured the job also builds one Google Sheet, trading_holidays, with a tab per exchange and a validation tab. The live run was a dry run; the four files above were uploaded by hand on 18 October, so the Drive API path itself is still unverified.</w:t>
+        <w:t>Not uploaded: _previous_combined.csv (the baseline for the run-to-run diff), run_meta.json and upload_manifest.json (internal bookkeeping), and raw/ (evidence, not the calendar). When the Drive secrets are configured the job also builds one Google Sheet, trading_holidays, with a tab per exchange and a validation tab. The live run was a dry run; I uploaded the files above to Drive by hand, so the Drive API path itself is still unverified.</w:t>
       </w:r>
     </w:p>
     <w:tbl>
@@ -1334,72 +971,11 @@
       </w:r>
     </w:p>
     <w:p>
-      <w:pPr>
-        <w:keepNext/>
-        <w:jc w:val="center"/>
-      </w:pPr>
-      <w:r>
-        <w:drawing>
-          <wp:inline xmlns:a="http://schemas.openxmlformats.org/drawingml/2006/main" xmlns:pic="http://schemas.openxmlformats.org/drawingml/2006/picture">
-            <wp:extent cx="5760000" cy="1877856"/>
-            <wp:docPr id="2" name="Picture 2"/>
-            <wp:cNvGraphicFramePr>
-              <a:graphicFrameLocks noChangeAspect="1"/>
-            </wp:cNvGraphicFramePr>
-            <a:graphic>
-              <a:graphicData uri="http://schemas.openxmlformats.org/drawingml/2006/picture">
-                <pic:pic>
-                  <pic:nvPicPr>
-                    <pic:cNvPr id="0" name="pipeline.png"/>
-                    <pic:cNvPicPr/>
-                  </pic:nvPicPr>
-                  <pic:blipFill>
-                    <a:blip r:embed="rId10"/>
-                    <a:stretch>
-                      <a:fillRect/>
-                    </a:stretch>
-                  </pic:blipFill>
-                  <pic:spPr>
-                    <a:xfrm>
-                      <a:off x="0" y="0"/>
-                      <a:ext cx="5760000" cy="1877856"/>
-                    </a:xfrm>
-                    <a:prstGeom prst="rect"/>
-                  </pic:spPr>
-                </pic:pic>
-              </a:graphicData>
-            </a:graphic>
-          </wp:inline>
-        </w:drawing>
-      </w:r>
-    </w:p>
-    <w:p>
-      <w:pPr>
-        <w:jc w:val="center"/>
-      </w:pPr>
-      <w:r>
-        <w:rPr>
-          <w:b/>
-          <w:color w:val="0F8B8D"/>
-          <w:sz w:val="19"/>
-        </w:rPr>
-        <w:t xml:space="preserve">Figure 2. </w:t>
-      </w:r>
-      <w:r>
-        <w:rPr>
-          <w:i/>
-          <w:color w:val="5C677D"/>
-          <w:sz w:val="19"/>
-        </w:rPr>
-        <w:t>The six stages of a run.</w:t>
-      </w:r>
-    </w:p>
-    <w:p>
       <w:r>
         <w:rPr>
           <w:i w:val="0"/>
         </w:rPr>
-        <w:t>There is one entry point, python -m scraper.run. It stamps a single UTC timestamp for the whole run (so a slow adapter cannot make one file look like two runs), calls the adapters in order, normalises the rows, validates them, writes the files and, if asked, uploads. The steps below follow that order.</w:t>
+        <w:t>There is one entry point, python -m scraper.run. It stamps a single UTC timestamp for the whole run (so a slow adapter cannot make one file look like two runs), calls the adapters in order, normalises the rows, validates them, writes the files and, if asked, uploads. Every fetched body is kept under raw/, and a crash in one adapter never stops the others. The steps below follow that order.</w:t>
       </w:r>
     </w:p>
     <w:p>
@@ -1980,186 +1556,11 @@
       </w:r>
     </w:p>
     <w:p>
-      <w:pPr>
-        <w:keepNext/>
-        <w:jc w:val="center"/>
-      </w:pPr>
-      <w:r>
-        <w:drawing>
-          <wp:inline xmlns:a="http://schemas.openxmlformats.org/drawingml/2006/main" xmlns:pic="http://schemas.openxmlformats.org/drawingml/2006/picture">
-            <wp:extent cx="3240000" cy="3462299"/>
-            <wp:docPr id="3" name="Picture 3"/>
-            <wp:cNvGraphicFramePr>
-              <a:graphicFrameLocks noChangeAspect="1"/>
-            </wp:cNvGraphicFramePr>
-            <a:graphic>
-              <a:graphicData uri="http://schemas.openxmlformats.org/drawingml/2006/picture">
-                <pic:pic>
-                  <pic:nvPicPr>
-                    <pic:cNvPr id="0" name="validation_checks.png"/>
-                    <pic:cNvPicPr/>
-                  </pic:nvPicPr>
-                  <pic:blipFill>
-                    <a:blip r:embed="rId11"/>
-                    <a:stretch>
-                      <a:fillRect/>
-                    </a:stretch>
-                  </pic:blipFill>
-                  <pic:spPr>
-                    <a:xfrm>
-                      <a:off x="0" y="0"/>
-                      <a:ext cx="3240000" cy="3462299"/>
-                    </a:xfrm>
-                    <a:prstGeom prst="rect"/>
-                  </pic:spPr>
-                </pic:pic>
-              </a:graphicData>
-            </a:graphic>
-          </wp:inline>
-        </w:drawing>
-      </w:r>
-    </w:p>
-    <w:p>
-      <w:pPr>
-        <w:jc w:val="center"/>
-      </w:pPr>
       <w:r>
         <w:rPr>
-          <w:b/>
-          <w:color w:val="0F8B8D"/>
-          <w:sz w:val="19"/>
+          <w:i w:val="0"/>
         </w:rPr>
-        <w:t xml:space="preserve">Figure 3. </w:t>
-      </w:r>
-      <w:r>
-        <w:rPr>
-          <w:i/>
-          <w:color w:val="5C677D"/>
-          <w:sz w:val="19"/>
-        </w:rPr>
-        <w:t>Outcome of the live run's checks.</w:t>
-      </w:r>
-    </w:p>
-    <w:p>
-      <w:pPr>
-        <w:keepNext/>
-        <w:jc w:val="center"/>
-      </w:pPr>
-      <w:r>
-        <w:drawing>
-          <wp:inline xmlns:a="http://schemas.openxmlformats.org/drawingml/2006/main" xmlns:pic="http://schemas.openxmlformats.org/drawingml/2006/picture">
-            <wp:extent cx="5760000" cy="1909787"/>
-            <wp:docPr id="4" name="Picture 4"/>
-            <wp:cNvGraphicFramePr>
-              <a:graphicFrameLocks noChangeAspect="1"/>
-            </wp:cNvGraphicFramePr>
-            <a:graphic>
-              <a:graphicData uri="http://schemas.openxmlformats.org/drawingml/2006/picture">
-                <pic:pic>
-                  <pic:nvPicPr>
-                    <pic:cNvPr id="0" name="calendar_2026.png"/>
-                    <pic:cNvPicPr/>
-                  </pic:nvPicPr>
-                  <pic:blipFill>
-                    <a:blip r:embed="rId12"/>
-                    <a:stretch>
-                      <a:fillRect/>
-                    </a:stretch>
-                  </pic:blipFill>
-                  <pic:spPr>
-                    <a:xfrm>
-                      <a:off x="0" y="0"/>
-                      <a:ext cx="5760000" cy="1909787"/>
-                    </a:xfrm>
-                    <a:prstGeom prst="rect"/>
-                  </pic:spPr>
-                </pic:pic>
-              </a:graphicData>
-            </a:graphic>
-          </wp:inline>
-        </w:drawing>
-      </w:r>
-    </w:p>
-    <w:p>
-      <w:pPr>
-        <w:jc w:val="center"/>
-      </w:pPr>
-      <w:r>
-        <w:rPr>
-          <w:b/>
-          <w:color w:val="0F8B8D"/>
-          <w:sz w:val="19"/>
-        </w:rPr>
-        <w:t xml:space="preserve">Figure 4. </w:t>
-      </w:r>
-      <w:r>
-        <w:rPr>
-          <w:i/>
-          <w:color w:val="5C677D"/>
-          <w:sz w:val="19"/>
-        </w:rPr>
-        <w:t>NYSE and NASDAQ 2026 closures and early closes; the cross-check found 0 differing dates.</w:t>
-      </w:r>
-    </w:p>
-    <w:p>
-      <w:pPr>
-        <w:keepNext/>
-        <w:jc w:val="center"/>
-      </w:pPr>
-      <w:r>
-        <w:drawing>
-          <wp:inline xmlns:a="http://schemas.openxmlformats.org/drawingml/2006/main" xmlns:pic="http://schemas.openxmlformats.org/drawingml/2006/picture">
-            <wp:extent cx="5760000" cy="2046683"/>
-            <wp:docPr id="5" name="Picture 5"/>
-            <wp:cNvGraphicFramePr>
-              <a:graphicFrameLocks noChangeAspect="1"/>
-            </wp:cNvGraphicFramePr>
-            <a:graphic>
-              <a:graphicData uri="http://schemas.openxmlformats.org/drawingml/2006/picture">
-                <pic:pic>
-                  <pic:nvPicPr>
-                    <pic:cNvPr id="0" name="calendar_2027.png"/>
-                    <pic:cNvPicPr/>
-                  </pic:nvPicPr>
-                  <pic:blipFill>
-                    <a:blip r:embed="rId13"/>
-                    <a:stretch>
-                      <a:fillRect/>
-                    </a:stretch>
-                  </pic:blipFill>
-                  <pic:spPr>
-                    <a:xfrm>
-                      <a:off x="0" y="0"/>
-                      <a:ext cx="5760000" cy="2046683"/>
-                    </a:xfrm>
-                    <a:prstGeom prst="rect"/>
-                  </pic:spPr>
-                </pic:pic>
-              </a:graphicData>
-            </a:graphic>
-          </wp:inline>
-        </w:drawing>
-      </w:r>
-    </w:p>
-    <w:p>
-      <w:pPr>
-        <w:jc w:val="center"/>
-      </w:pPr>
-      <w:r>
-        <w:rPr>
-          <w:b/>
-          <w:color w:val="0F8B8D"/>
-          <w:sz w:val="19"/>
-        </w:rPr>
-        <w:t xml:space="preserve">Figure 5. </w:t>
-      </w:r>
-      <w:r>
-        <w:rPr>
-          <w:i/>
-          <w:color w:val="5C677D"/>
-          <w:sz w:val="19"/>
-        </w:rPr>
-        <w:t>2027: NYSE and CME equity index agree on all 10 closures and the day-after-Thanksgiving early close. NASDAQ and OPRA have not published 2027 yet.</w:t>
+        <w:t>The cross-exchange checks are the ones that matter most. NYSE and NASDAQ list the same ten closures and the same two early closes in 2026. For 2027, where the CME files cover a full year, NYSE and CME equity index agree on all ten closures and on the early close the day after Thanksgiving. OPRA cannot be compared yet because its only schedule is 2025, which is why those two checks are WARN.</w:t>
       </w:r>
     </w:p>
     <w:tbl>
@@ -4598,55 +3999,20 @@
       </w:tr>
     </w:tbl>
     <w:p/>
-    <w:tbl>
-      <w:tblPr>
-        <w:tblW w:type="auto" w:w="0"/>
-        <w:jc w:val="center"/>
-        <w:tblLayout w:type="fixed"/>
-        <w:tblLook w:firstColumn="1" w:firstRow="1" w:lastColumn="0" w:lastRow="0" w:noHBand="0" w:noVBand="1" w:val="04A0"/>
-        <w:tblLayout w:type="fixed"/>
-      </w:tblPr>
-      <w:tblGrid>
-        <w:gridCol w:w="9411"/>
-      </w:tblGrid>
-      <w:tr>
-        <w:trPr>
-          <w:cantSplit/>
-        </w:trPr>
-        <w:tc>
-          <w:tcPr>
-            <w:tcW w:type="dxa" w:w="9411"/>
-            <w:shd w:val="clear" w:color="auto" w:fill="14213D"/>
-            <w:tcMar>
-              <w:top w:w="198" w:type="dxa"/>
-              <w:left w:w="198" w:type="dxa"/>
-              <w:bottom w:w="198" w:type="dxa"/>
-              <w:right w:w="198" w:type="dxa"/>
-            </w:tcMar>
-          </w:tcPr>
-          <w:p>
-            <w:r>
-              <w:rPr>
-                <w:b/>
-                <w:color w:val="FFFFFF"/>
-                <w:sz w:val="24"/>
-              </w:rPr>
-              <w:t>What 'fetch everything' can and cannot mean</w:t>
-            </w:r>
-          </w:p>
-          <w:p>
-            <w:r>
-              <w:rPr>
-                <w:color w:val="FFFFFF"/>
-                <w:sz w:val="21"/>
-              </w:rPr>
-              <w:t>The job fetches NYSE, NASDAQ and every OPRA PDF linked from opraplan.com. It does not fetch CME and it does not invent an OPRA 2026 calendar; CME appears automatically once an operator places its files in input/cme/.</w:t>
-            </w:r>
-          </w:p>
-        </w:tc>
-      </w:tr>
-    </w:tbl>
-    <w:p/>
+    <w:p>
+      <w:r>
+        <w:rPr>
+          <w:b/>
+        </w:rPr>
+        <w:t xml:space="preserve">What 'fetch everything' can and cannot mean. </w:t>
+      </w:r>
+      <w:r>
+        <w:rPr>
+          <w:i w:val="0"/>
+        </w:rPr>
+        <w:t>The job fetches NYSE, NASDAQ and every OPRA PDF linked from opraplan.com. It does not fetch CME and it does not invent an OPRA 2026 calendar. CME rows appear when the downloaded files are in input/cme/; those files are not in the repository, so the scheduled run on GitHub publishes no CME rows unless they are provided to it.</w:t>
+      </w:r>
+    </w:p>
     <w:p>
       <w:pPr>
         <w:pStyle w:val="Heading1"/>
@@ -5189,7 +4555,7 @@
       </w:r>
     </w:p>
     <w:sectPr>
-      <w:footerReference w:type="default" r:id="rId14"/>
+      <w:footerReference w:type="default" r:id="rId9"/>
       <w:pgSz w:w="11906" w:h="16838"/>
       <w:pgMar w:top="1134" w:right="1247" w:bottom="1134" w:left="1247" w:header="720" w:footer="720" w:gutter="0"/>
       <w:cols w:space="720"/>

</xml_diff>